<commit_message>
Add PWA install prompt with OS detection for Android and iOS
</commit_message>
<xml_diff>
--- a/CAHIER_DE_CHARGES_MARKETING_V2.docx
+++ b/CAHIER_DE_CHARGES_MARKETING_V2.docx
@@ -40,16 +40,325 @@
     </w:p>
     <w:p>
       <w:pPr>
+        <w:rPr>
+          <w:lang w:val="fr-FR"/>
+        </w:rPr>
+      </w:pPr>
+    </w:p>
+    <w:p>
+      <w:pPr>
+        <w:rPr>
+          <w:lang w:val="fr-FR"/>
+        </w:rPr>
+      </w:pPr>
+      <w:proofErr w:type="gramStart"/>
+      <w:r>
+        <w:rPr>
+          <w:b/>
+          <w:lang w:val="fr-FR"/>
+        </w:rPr>
+        <w:t>Date:</w:t>
+      </w:r>
+      <w:proofErr w:type="gramEnd"/>
+      <w:r>
+        <w:rPr>
+          <w:b/>
+          <w:lang w:val="fr-FR"/>
+        </w:rPr>
+        <w:t xml:space="preserve"> 7 septembre 2026</w:t>
+      </w:r>
+    </w:p>
+    <w:p>
+      <w:pPr>
+        <w:rPr>
+          <w:lang w:val="fr-FR"/>
+        </w:rPr>
+      </w:pPr>
+      <w:proofErr w:type="gramStart"/>
+      <w:r>
+        <w:rPr>
+          <w:b/>
+          <w:lang w:val="fr-FR"/>
+        </w:rPr>
+        <w:t>Version:</w:t>
+      </w:r>
+      <w:proofErr w:type="gramEnd"/>
+      <w:r>
+        <w:rPr>
+          <w:b/>
+          <w:lang w:val="fr-FR"/>
+        </w:rPr>
+        <w:t xml:space="preserve"> 1.0</w:t>
+      </w:r>
+    </w:p>
+    <w:p>
+      <w:pPr>
+        <w:rPr>
+          <w:lang w:val="fr-FR"/>
+        </w:rPr>
+      </w:pPr>
+      <w:proofErr w:type="gramStart"/>
+      <w:r>
+        <w:rPr>
+          <w:b/>
+          <w:lang w:val="fr-FR"/>
+        </w:rPr>
+        <w:t>Destinataire:</w:t>
+      </w:r>
+      <w:proofErr w:type="gramEnd"/>
+      <w:r>
+        <w:rPr>
+          <w:b/>
+          <w:lang w:val="fr-FR"/>
+        </w:rPr>
+        <w:t xml:space="preserve"> Équipe Marketing</w:t>
+      </w:r>
+    </w:p>
+    <w:p>
+      <w:pPr>
+        <w:rPr>
+          <w:lang w:val="fr-FR"/>
+        </w:rPr>
+      </w:pPr>
+      <w:proofErr w:type="gramStart"/>
+      <w:r>
+        <w:rPr>
+          <w:b/>
+          <w:lang w:val="fr-FR"/>
+        </w:rPr>
+        <w:t>Émetteur:</w:t>
+      </w:r>
+      <w:proofErr w:type="gramEnd"/>
+      <w:r>
+        <w:rPr>
+          <w:b/>
+          <w:lang w:val="fr-FR"/>
+        </w:rPr>
+        <w:t xml:space="preserve"> Vision Unique Team</w:t>
+      </w:r>
+    </w:p>
+    <w:p>
+      <w:pPr>
+        <w:rPr>
+          <w:lang w:val="fr-FR"/>
+        </w:rPr>
+      </w:pPr>
+    </w:p>
+    <w:p>
+      <w:pPr>
         <w:jc w:val="center"/>
         <w:rPr>
           <w:lang w:val="fr-FR"/>
         </w:rPr>
       </w:pPr>
-      <w:r>
-        <w:rPr>
-          <w:lang w:val="fr-FR"/>
-        </w:rPr>
-        <w:t>__________________________________________________</w:t>
+    </w:p>
+    <w:p>
+      <w:pPr>
+        <w:rPr>
+          <w:lang w:val="fr-FR"/>
+        </w:rPr>
+      </w:pPr>
+    </w:p>
+    <w:p>
+      <w:pPr>
+        <w:pStyle w:val="Titre2"/>
+        <w:rPr>
+          <w:lang w:val="fr-FR"/>
+        </w:rPr>
+      </w:pPr>
+      <w:r>
+        <w:rPr>
+          <w:lang w:val="fr-FR"/>
+        </w:rPr>
+        <w:t>1. PRÉSENTATION GÉNÉRALE</w:t>
+      </w:r>
+    </w:p>
+    <w:p>
+      <w:pPr>
+        <w:rPr>
+          <w:lang w:val="fr-FR"/>
+        </w:rPr>
+      </w:pPr>
+    </w:p>
+    <w:p>
+      <w:pPr>
+        <w:pStyle w:val="Titre3"/>
+        <w:rPr>
+          <w:lang w:val="fr-FR"/>
+        </w:rPr>
+      </w:pPr>
+      <w:r>
+        <w:rPr>
+          <w:lang w:val="fr-FR"/>
+        </w:rPr>
+        <w:t>1.1 Contexte du Projet</w:t>
+      </w:r>
+    </w:p>
+    <w:p>
+      <w:r>
+        <w:rPr>
+          <w:lang w:val="fr-FR"/>
+        </w:rPr>
+        <w:t xml:space="preserve">Vision Unique est une plateforme innovante qui révolutionne la gestion des dépôts et la distribution de produits en République Démocratique du Congo. </w:t>
+      </w:r>
+      <w:r>
+        <w:t xml:space="preserve">Notre </w:t>
+      </w:r>
+      <w:proofErr w:type="spellStart"/>
+      <w:r>
+        <w:t>écosystème</w:t>
+      </w:r>
+      <w:proofErr w:type="spellEnd"/>
+      <w:r>
+        <w:t xml:space="preserve"> se compose de deux applications principales:</w:t>
+      </w:r>
+    </w:p>
+    <w:p/>
+    <w:p>
+      <w:pPr>
+        <w:pStyle w:val="Listepuces"/>
+        <w:rPr>
+          <w:lang w:val="fr-FR"/>
+        </w:rPr>
+      </w:pPr>
+      <w:r>
+        <w:rPr>
+          <w:lang w:val="fr-FR"/>
+        </w:rPr>
+        <w:t>**Maman Power App**: Application mobile pour les consommateurs</w:t>
+      </w:r>
+    </w:p>
+    <w:p>
+      <w:pPr>
+        <w:pStyle w:val="Listepuces"/>
+        <w:rPr>
+          <w:lang w:val="fr-FR"/>
+        </w:rPr>
+      </w:pPr>
+      <w:r>
+        <w:rPr>
+          <w:lang w:val="fr-FR"/>
+        </w:rPr>
+        <w:t>**</w:t>
+      </w:r>
+      <w:proofErr w:type="spellStart"/>
+      <w:r>
+        <w:rPr>
+          <w:lang w:val="fr-FR"/>
+        </w:rPr>
+        <w:t>Depot</w:t>
+      </w:r>
+      <w:proofErr w:type="spellEnd"/>
+      <w:r>
+        <w:rPr>
+          <w:lang w:val="fr-FR"/>
+        </w:rPr>
+        <w:t xml:space="preserve"> Dashboard**: Tableau de bord pour les gestionnaires de dépôts</w:t>
+      </w:r>
+    </w:p>
+    <w:p>
+      <w:pPr>
+        <w:rPr>
+          <w:lang w:val="fr-FR"/>
+        </w:rPr>
+      </w:pPr>
+    </w:p>
+    <w:p>
+      <w:pPr>
+        <w:pStyle w:val="Titre3"/>
+      </w:pPr>
+      <w:r>
+        <w:t xml:space="preserve">1.2 </w:t>
+      </w:r>
+      <w:proofErr w:type="spellStart"/>
+      <w:r>
+        <w:t>Objectifs</w:t>
+      </w:r>
+      <w:proofErr w:type="spellEnd"/>
+      <w:r>
+        <w:t xml:space="preserve"> </w:t>
+      </w:r>
+      <w:proofErr w:type="spellStart"/>
+      <w:r>
+        <w:t>Stratégiques</w:t>
+      </w:r>
+      <w:proofErr w:type="spellEnd"/>
+    </w:p>
+    <w:p>
+      <w:pPr>
+        <w:pStyle w:val="Listepuces"/>
+        <w:rPr>
+          <w:lang w:val="fr-FR"/>
+        </w:rPr>
+      </w:pPr>
+      <w:r>
+        <w:rPr>
+          <w:lang w:val="fr-FR"/>
+        </w:rPr>
+        <w:t>Digitaliser le secteur de la distribution de produits</w:t>
+      </w:r>
+    </w:p>
+    <w:p>
+      <w:pPr>
+        <w:pStyle w:val="Listepuces"/>
+        <w:rPr>
+          <w:lang w:val="fr-FR"/>
+        </w:rPr>
+      </w:pPr>
+      <w:r>
+        <w:rPr>
+          <w:lang w:val="fr-FR"/>
+        </w:rPr>
+        <w:t>Faciliter l'accès aux produits pour les consommateurs</w:t>
+      </w:r>
+    </w:p>
+    <w:p>
+      <w:pPr>
+        <w:pStyle w:val="Listepuces"/>
+        <w:rPr>
+          <w:lang w:val="fr-FR"/>
+        </w:rPr>
+      </w:pPr>
+      <w:r>
+        <w:rPr>
+          <w:lang w:val="fr-FR"/>
+        </w:rPr>
+        <w:t>Optimiser la gestion des dépôts pour les vendeurs</w:t>
+      </w:r>
+    </w:p>
+    <w:p>
+      <w:pPr>
+        <w:pStyle w:val="Listepuces"/>
+        <w:rPr>
+          <w:lang w:val="fr-FR"/>
+        </w:rPr>
+      </w:pPr>
+      <w:r>
+        <w:rPr>
+          <w:lang w:val="fr-FR"/>
+        </w:rPr>
+        <w:t>Créer un écosystème connecté et transparent</w:t>
+      </w:r>
+    </w:p>
+    <w:p>
+      <w:pPr>
+        <w:rPr>
+          <w:lang w:val="fr-FR"/>
+        </w:rPr>
+      </w:pPr>
+    </w:p>
+    <w:p>
+      <w:pPr>
+        <w:pStyle w:val="Titre3"/>
+        <w:rPr>
+          <w:lang w:val="fr-FR"/>
+        </w:rPr>
+      </w:pPr>
+      <w:r>
+        <w:rPr>
+          <w:lang w:val="fr-FR"/>
+        </w:rPr>
+        <w:t>1.3 Public Cible</w:t>
       </w:r>
     </w:p>
     <w:p>
@@ -70,301 +379,17 @@
           <w:b/>
           <w:lang w:val="fr-FR"/>
         </w:rPr>
-        <w:t>Date: 7 septembre 2026</w:t>
-      </w:r>
-    </w:p>
-    <w:p>
-      <w:pPr>
-        <w:rPr>
-          <w:lang w:val="fr-FR"/>
-        </w:rPr>
-      </w:pPr>
+        <w:t>Consommateurs (Maman Power App</w:t>
+      </w:r>
+      <w:proofErr w:type="gramStart"/>
       <w:r>
         <w:rPr>
           <w:b/>
           <w:lang w:val="fr-FR"/>
         </w:rPr>
-        <w:t>Version: 1.0</w:t>
-      </w:r>
-    </w:p>
-    <w:p>
-      <w:pPr>
-        <w:rPr>
-          <w:lang w:val="fr-FR"/>
-        </w:rPr>
-      </w:pPr>
-      <w:r>
-        <w:rPr>
-          <w:b/>
-          <w:lang w:val="fr-FR"/>
-        </w:rPr>
-        <w:t>Destinataire: Équipe Marketing</w:t>
-      </w:r>
-    </w:p>
-    <w:p>
-      <w:pPr>
-        <w:rPr>
-          <w:lang w:val="fr-FR"/>
-        </w:rPr>
-      </w:pPr>
-      <w:r>
-        <w:rPr>
-          <w:b/>
-          <w:lang w:val="fr-FR"/>
-        </w:rPr>
-        <w:t>Émetteur: Vision Unique Team</w:t>
-      </w:r>
-    </w:p>
-    <w:p>
-      <w:pPr>
-        <w:rPr>
-          <w:lang w:val="fr-FR"/>
-        </w:rPr>
-      </w:pPr>
-    </w:p>
-    <w:p>
-      <w:pPr>
-        <w:jc w:val="center"/>
-        <w:rPr>
-          <w:lang w:val="fr-FR"/>
-        </w:rPr>
-      </w:pPr>
-      <w:r>
-        <w:rPr>
-          <w:lang w:val="fr-FR"/>
-        </w:rPr>
-        <w:t>__________________________________________________</w:t>
-      </w:r>
-    </w:p>
-    <w:p>
-      <w:pPr>
-        <w:rPr>
-          <w:lang w:val="fr-FR"/>
-        </w:rPr>
-      </w:pPr>
-    </w:p>
-    <w:p>
-      <w:pPr>
-        <w:pStyle w:val="Titre2"/>
-        <w:rPr>
-          <w:lang w:val="fr-FR"/>
-        </w:rPr>
-      </w:pPr>
-      <w:r>
-        <w:rPr>
-          <w:lang w:val="fr-FR"/>
-        </w:rPr>
-        <w:t>1. PRÉSENTATION GÉNÉRALE</w:t>
-      </w:r>
-    </w:p>
-    <w:p>
-      <w:pPr>
-        <w:rPr>
-          <w:lang w:val="fr-FR"/>
-        </w:rPr>
-      </w:pPr>
-    </w:p>
-    <w:p>
-      <w:pPr>
-        <w:pStyle w:val="Titre3"/>
-        <w:rPr>
-          <w:lang w:val="fr-FR"/>
-        </w:rPr>
-      </w:pPr>
-      <w:r>
-        <w:rPr>
-          <w:lang w:val="fr-FR"/>
-        </w:rPr>
-        <w:t>1.1 Contexte du Projet</w:t>
-      </w:r>
-    </w:p>
-    <w:p>
-      <w:r>
-        <w:rPr>
-          <w:lang w:val="fr-FR"/>
-        </w:rPr>
-        <w:t xml:space="preserve">Vision Unique est une plateforme innovante qui révolutionne la gestion des dépôts et la distribution de produits en République Démocratique du Congo. </w:t>
-      </w:r>
-      <w:r>
-        <w:t xml:space="preserve">Notre </w:t>
-      </w:r>
-      <w:proofErr w:type="spellStart"/>
-      <w:r>
-        <w:t>écosystème</w:t>
-      </w:r>
-      <w:proofErr w:type="spellEnd"/>
-      <w:r>
-        <w:t xml:space="preserve"> se compose de deux applications principales:</w:t>
-      </w:r>
-    </w:p>
-    <w:p/>
-    <w:p>
-      <w:pPr>
-        <w:pStyle w:val="Listepuces"/>
-        <w:rPr>
-          <w:lang w:val="fr-FR"/>
-        </w:rPr>
-      </w:pPr>
-      <w:r>
-        <w:rPr>
-          <w:lang w:val="fr-FR"/>
-        </w:rPr>
-        <w:t>**Maman Power App**: Application mobile pour les consommateurs</w:t>
-      </w:r>
-    </w:p>
-    <w:p>
-      <w:pPr>
-        <w:pStyle w:val="Listepuces"/>
-        <w:rPr>
-          <w:lang w:val="fr-FR"/>
-        </w:rPr>
-      </w:pPr>
-      <w:r>
-        <w:rPr>
-          <w:lang w:val="fr-FR"/>
-        </w:rPr>
-        <w:t>**</w:t>
-      </w:r>
-      <w:proofErr w:type="spellStart"/>
-      <w:r>
-        <w:rPr>
-          <w:lang w:val="fr-FR"/>
-        </w:rPr>
-        <w:t>Depot</w:t>
-      </w:r>
-      <w:proofErr w:type="spellEnd"/>
-      <w:r>
-        <w:rPr>
-          <w:lang w:val="fr-FR"/>
-        </w:rPr>
-        <w:t xml:space="preserve"> Dashboard**: Tableau de bord pour les gestionnaires de dépôts</w:t>
-      </w:r>
-    </w:p>
-    <w:p>
-      <w:pPr>
-        <w:rPr>
-          <w:lang w:val="fr-FR"/>
-        </w:rPr>
-      </w:pPr>
-    </w:p>
-    <w:p>
-      <w:pPr>
-        <w:pStyle w:val="Titre3"/>
-      </w:pPr>
-      <w:r>
-        <w:t xml:space="preserve">1.2 </w:t>
-      </w:r>
-      <w:proofErr w:type="spellStart"/>
-      <w:r>
-        <w:t>Objectifs</w:t>
-      </w:r>
-      <w:proofErr w:type="spellEnd"/>
-      <w:r>
-        <w:t xml:space="preserve"> </w:t>
-      </w:r>
-      <w:proofErr w:type="spellStart"/>
-      <w:r>
-        <w:t>Stratégiques</w:t>
-      </w:r>
-      <w:proofErr w:type="spellEnd"/>
-    </w:p>
-    <w:p>
-      <w:pPr>
-        <w:pStyle w:val="Listepuces"/>
-        <w:rPr>
-          <w:lang w:val="fr-FR"/>
-        </w:rPr>
-      </w:pPr>
-      <w:r>
-        <w:rPr>
-          <w:lang w:val="fr-FR"/>
-        </w:rPr>
-        <w:t>Digitaliser le secteur de la distribution de produits</w:t>
-      </w:r>
-    </w:p>
-    <w:p>
-      <w:pPr>
-        <w:pStyle w:val="Listepuces"/>
-        <w:rPr>
-          <w:lang w:val="fr-FR"/>
-        </w:rPr>
-      </w:pPr>
-      <w:r>
-        <w:rPr>
-          <w:lang w:val="fr-FR"/>
-        </w:rPr>
-        <w:t>Faciliter l'accès aux produits pour les consommateurs</w:t>
-      </w:r>
-    </w:p>
-    <w:p>
-      <w:pPr>
-        <w:pStyle w:val="Listepuces"/>
-        <w:rPr>
-          <w:lang w:val="fr-FR"/>
-        </w:rPr>
-      </w:pPr>
-      <w:r>
-        <w:rPr>
-          <w:lang w:val="fr-FR"/>
-        </w:rPr>
-        <w:t>Optimiser la gestion des dépôts pour les vendeurs</w:t>
-      </w:r>
-    </w:p>
-    <w:p>
-      <w:pPr>
-        <w:pStyle w:val="Listepuces"/>
-        <w:rPr>
-          <w:lang w:val="fr-FR"/>
-        </w:rPr>
-      </w:pPr>
-      <w:r>
-        <w:rPr>
-          <w:lang w:val="fr-FR"/>
-        </w:rPr>
-        <w:t>Créer un écosystème connecté et transparent</w:t>
-      </w:r>
-    </w:p>
-    <w:p>
-      <w:pPr>
-        <w:rPr>
-          <w:lang w:val="fr-FR"/>
-        </w:rPr>
-      </w:pPr>
-    </w:p>
-    <w:p>
-      <w:pPr>
-        <w:pStyle w:val="Titre3"/>
-        <w:rPr>
-          <w:lang w:val="fr-FR"/>
-        </w:rPr>
-      </w:pPr>
-      <w:r>
-        <w:rPr>
-          <w:lang w:val="fr-FR"/>
-        </w:rPr>
-        <w:t>1.3 Public Cible</w:t>
-      </w:r>
-    </w:p>
-    <w:p>
-      <w:pPr>
-        <w:rPr>
-          <w:lang w:val="fr-FR"/>
-        </w:rPr>
-      </w:pPr>
-    </w:p>
-    <w:p>
-      <w:pPr>
-        <w:rPr>
-          <w:lang w:val="fr-FR"/>
-        </w:rPr>
-      </w:pPr>
-      <w:r>
-        <w:rPr>
-          <w:b/>
-          <w:lang w:val="fr-FR"/>
-        </w:rPr>
-        <w:t>Consommateurs (Maman Power App):</w:t>
-      </w:r>
+        <w:t>):</w:t>
+      </w:r>
+      <w:proofErr w:type="gramEnd"/>
     </w:p>
     <w:p>
       <w:pPr>
@@ -555,7 +580,15 @@
       </w:r>
       <w:proofErr w:type="spellEnd"/>
       <w:r>
-        <w:t xml:space="preserve"> des dépôts préférés</w:t>
+        <w:t xml:space="preserve"> des </w:t>
+      </w:r>
+      <w:proofErr w:type="spellStart"/>
+      <w:r>
+        <w:t>dépôts</w:t>
+      </w:r>
+      <w:proofErr w:type="spellEnd"/>
+      <w:r>
+        <w:t xml:space="preserve"> préférés</w:t>
       </w:r>
     </w:p>
     <w:p>
@@ -725,7 +758,15 @@
       </w:r>
       <w:proofErr w:type="spellEnd"/>
       <w:r>
-        <w:t>**: 4 forfaits (Standard, Basic, Advanced, Elite)</w:t>
+        <w:t xml:space="preserve">**: 4 </w:t>
+      </w:r>
+      <w:proofErr w:type="spellStart"/>
+      <w:r>
+        <w:t>forfaits</w:t>
+      </w:r>
+      <w:proofErr w:type="spellEnd"/>
+      <w:r>
+        <w:t xml:space="preserve"> (Standard, Basic, Advanced, Elite)</w:t>
       </w:r>
     </w:p>
     <w:p>
@@ -923,22 +964,37 @@
         <w:rPr>
           <w:lang w:val="fr-FR"/>
         </w:rPr>
-        <w:t>2.3 Fonctionnalité Star: Groupe WhatsApp Privé (Advanced &amp; Elite)</w:t>
-      </w:r>
-    </w:p>
-    <w:p>
-      <w:pPr>
-        <w:rPr>
-          <w:lang w:val="fr-FR"/>
-        </w:rPr>
-      </w:pPr>
-    </w:p>
-    <w:p>
-      <w:pPr>
-        <w:rPr>
-          <w:lang w:val="fr-FR"/>
-        </w:rPr>
-      </w:pPr>
+        <w:t xml:space="preserve">2.3 Fonctionnalité </w:t>
+      </w:r>
+      <w:proofErr w:type="gramStart"/>
+      <w:r>
+        <w:rPr>
+          <w:lang w:val="fr-FR"/>
+        </w:rPr>
+        <w:t>Star:</w:t>
+      </w:r>
+      <w:proofErr w:type="gramEnd"/>
+      <w:r>
+        <w:rPr>
+          <w:lang w:val="fr-FR"/>
+        </w:rPr>
+        <w:t xml:space="preserve"> Groupe WhatsApp Privé (Advanced &amp; Elite)</w:t>
+      </w:r>
+    </w:p>
+    <w:p>
+      <w:pPr>
+        <w:rPr>
+          <w:lang w:val="fr-FR"/>
+        </w:rPr>
+      </w:pPr>
+    </w:p>
+    <w:p>
+      <w:pPr>
+        <w:rPr>
+          <w:lang w:val="fr-FR"/>
+        </w:rPr>
+      </w:pPr>
+      <w:proofErr w:type="gramStart"/>
       <w:r>
         <w:rPr>
           <w:b/>
@@ -946,6 +1002,7 @@
         </w:rPr>
         <w:t>Concept:</w:t>
       </w:r>
+      <w:proofErr w:type="gramEnd"/>
     </w:p>
     <w:p>
       <w:pPr>
@@ -1228,15 +1285,25 @@
           <w:u w:val="single"/>
           <w:lang w:val="fr-FR"/>
         </w:rPr>
-        <w:t>Fonctionnalités Avancées</w:t>
-      </w:r>
+        <w:t xml:space="preserve">Fonctionnalités </w:t>
+      </w:r>
+      <w:proofErr w:type="gramStart"/>
       <w:r>
         <w:rPr>
           <w:b/>
+          <w:u w:val="single"/>
+          <w:lang w:val="fr-FR"/>
+        </w:rPr>
+        <w:t>Avancées</w:t>
+      </w:r>
+      <w:r>
+        <w:rPr>
+          <w:b/>
           <w:lang w:val="fr-FR"/>
         </w:rPr>
         <w:t>:</w:t>
       </w:r>
+      <w:proofErr w:type="gramEnd"/>
     </w:p>
     <w:p>
       <w:pPr>
@@ -1791,12 +1858,21 @@
           <w:lang w:val="fr-FR"/>
         </w:rPr>
       </w:pPr>
+      <w:proofErr w:type="gramStart"/>
       <w:r>
         <w:rPr>
           <w:b/>
           <w:lang w:val="fr-FR"/>
         </w:rPr>
-        <w:t>Slogan: "Vision Unique - Votre Dépôt, Votre Vision"</w:t>
+        <w:t>Slogan:</w:t>
+      </w:r>
+      <w:proofErr w:type="gramEnd"/>
+      <w:r>
+        <w:rPr>
+          <w:b/>
+          <w:lang w:val="fr-FR"/>
+        </w:rPr>
+        <w:t xml:space="preserve"> "Vision Unique - Votre Dépôt, Votre Vision"</w:t>
       </w:r>
     </w:p>
     <w:p>
@@ -2869,7 +2945,15 @@
       </w:r>
       <w:proofErr w:type="spellEnd"/>
       <w:r>
-        <w:t xml:space="preserve"> directe via WhatsApp (Advanced/Elite)</w:t>
+        <w:t xml:space="preserve"> </w:t>
+      </w:r>
+      <w:proofErr w:type="spellStart"/>
+      <w:r>
+        <w:t>directe</w:t>
+      </w:r>
+      <w:proofErr w:type="spellEnd"/>
+      <w:r>
+        <w:t xml:space="preserve"> via WhatsApp (Advanced/Elite)</w:t>
       </w:r>
     </w:p>
     <w:p/>
@@ -3010,8 +3094,13 @@
         <w:pStyle w:val="Listepuces"/>
       </w:pPr>
       <w:r>
-        <w:t>Formation continue</w:t>
-      </w:r>
+        <w:t xml:space="preserve">Formation </w:t>
+      </w:r>
+      <w:proofErr w:type="gramStart"/>
+      <w:r>
+        <w:t>continue</w:t>
+      </w:r>
+      <w:proofErr w:type="gramEnd"/>
     </w:p>
     <w:p>
       <w:pPr>
@@ -3170,8 +3259,16 @@
         <w:rPr>
           <w:lang w:val="fr-FR"/>
         </w:rPr>
-        <w:t>La clé du succès réside dans:</w:t>
-      </w:r>
+        <w:t xml:space="preserve">La clé du succès réside </w:t>
+      </w:r>
+      <w:proofErr w:type="gramStart"/>
+      <w:r>
+        <w:rPr>
+          <w:lang w:val="fr-FR"/>
+        </w:rPr>
+        <w:t>dans:</w:t>
+      </w:r>
+      <w:proofErr w:type="gramEnd"/>
     </w:p>
     <w:p>
       <w:pPr>

</xml_diff>